<commit_message>
docs: Se agrega evidencias beanstalk
</commit_message>
<xml_diff>
--- a/Entrega1/Proyecto 1 entrega 1 - Documento.docx
+++ b/Entrega1/Proyecto 1 entrega 1 - Documento.docx
@@ -6,7 +6,7 @@
       <w:pPr>
         <w:pStyle w:val="Ttulo1"/>
       </w:pPr>
-      <w:bookmarkStart w:id="0" w:name="_Toc226808634"/>
+      <w:bookmarkStart w:id="0" w:name="_Toc226817628"/>
       <w:r>
         <w:t>Proyecto 1</w:t>
       </w:r>
@@ -21,7 +21,13 @@
     <w:sdt>
       <w:sdtPr>
         <w:rPr>
-          <w:lang w:val="es-ES"/>
+          <w:rFonts w:ascii="Roboto Lt" w:eastAsia="Roboto Lt" w:hAnsi="Roboto Lt" w:cs="Roboto Lt"/>
+          <w:b w:val="0"/>
+          <w:bCs w:val="0"/>
+          <w:color w:val="auto"/>
+          <w:sz w:val="22"/>
+          <w:szCs w:val="22"/>
+          <w:lang w:val="es-ES" w:eastAsia="en-US"/>
         </w:rPr>
         <w:id w:val="-1430658765"/>
         <w:docPartObj>
@@ -31,12 +37,8 @@
       </w:sdtPr>
       <w:sdtEndPr>
         <w:rPr>
-          <w:rFonts w:ascii="Roboto Lt" w:eastAsia="Roboto Lt" w:hAnsi="Roboto Lt" w:cs="Roboto Lt"/>
           <w:noProof/>
-          <w:color w:val="auto"/>
-          <w:sz w:val="22"/>
-          <w:szCs w:val="22"/>
-          <w:lang w:val="es-CO" w:eastAsia="en-US"/>
+          <w:lang w:val="es-CO"/>
         </w:rPr>
       </w:sdtEndPr>
       <w:sdtContent>
@@ -86,7 +88,7 @@
             </w:rPr>
             <w:fldChar w:fldCharType="separate"/>
           </w:r>
-          <w:hyperlink w:anchor="_Toc226808634" w:history="1">
+          <w:hyperlink w:anchor="_Toc226817628" w:history="1">
             <w:r>
               <w:rPr>
                 <w:rStyle w:val="Hipervnculo"/>
@@ -113,7 +115,7 @@
                 <w:noProof/>
                 <w:webHidden/>
               </w:rPr>
-              <w:instrText xml:space="preserve"> PAGEREF _Toc226808634 \h </w:instrText>
+              <w:instrText xml:space="preserve"> PAGEREF _Toc226817628 \h </w:instrText>
             </w:r>
             <w:r>
               <w:rPr>
@@ -162,7 +164,7 @@
               <w14:ligatures w14:val="standardContextual"/>
             </w:rPr>
           </w:pPr>
-          <w:hyperlink w:anchor="_Toc226808635" w:history="1">
+          <w:hyperlink w:anchor="_Toc226817629" w:history="1">
             <w:r>
               <w:rPr>
                 <w:rStyle w:val="Hipervnculo"/>
@@ -189,7 +191,7 @@
                 <w:noProof/>
                 <w:webHidden/>
               </w:rPr>
-              <w:instrText xml:space="preserve"> PAGEREF _Toc226808635 \h </w:instrText>
+              <w:instrText xml:space="preserve"> PAGEREF _Toc226817629 \h </w:instrText>
             </w:r>
             <w:r>
               <w:rPr>
@@ -238,7 +240,7 @@
               <w14:ligatures w14:val="standardContextual"/>
             </w:rPr>
           </w:pPr>
-          <w:hyperlink w:anchor="_Toc226808636" w:history="1">
+          <w:hyperlink w:anchor="_Toc226817630" w:history="1">
             <w:r>
               <w:rPr>
                 <w:rStyle w:val="Hipervnculo"/>
@@ -265,7 +267,7 @@
                 <w:noProof/>
                 <w:webHidden/>
               </w:rPr>
-              <w:instrText xml:space="preserve"> PAGEREF _Toc226808636 \h </w:instrText>
+              <w:instrText xml:space="preserve"> PAGEREF _Toc226817630 \h </w:instrText>
             </w:r>
             <w:r>
               <w:rPr>
@@ -312,7 +314,7 @@
               <w14:ligatures w14:val="standardContextual"/>
             </w:rPr>
           </w:pPr>
-          <w:hyperlink w:anchor="_Toc226808637" w:history="1">
+          <w:hyperlink w:anchor="_Toc226817631" w:history="1">
             <w:r>
               <w:rPr>
                 <w:rStyle w:val="Hipervnculo"/>
@@ -339,7 +341,7 @@
                 <w:noProof/>
                 <w:webHidden/>
               </w:rPr>
-              <w:instrText xml:space="preserve"> PAGEREF _Toc226808637 \h </w:instrText>
+              <w:instrText xml:space="preserve"> PAGEREF _Toc226817631 \h </w:instrText>
             </w:r>
             <w:r>
               <w:rPr>
@@ -386,7 +388,7 @@
               <w14:ligatures w14:val="standardContextual"/>
             </w:rPr>
           </w:pPr>
-          <w:hyperlink w:anchor="_Toc226808638" w:history="1">
+          <w:hyperlink w:anchor="_Toc226817632" w:history="1">
             <w:r>
               <w:rPr>
                 <w:rStyle w:val="Hipervnculo"/>
@@ -413,7 +415,7 @@
                 <w:noProof/>
                 <w:webHidden/>
               </w:rPr>
-              <w:instrText xml:space="preserve"> PAGEREF _Toc226808638 \h </w:instrText>
+              <w:instrText xml:space="preserve"> PAGEREF _Toc226817632 \h </w:instrText>
             </w:r>
             <w:r>
               <w:rPr>
@@ -433,7 +435,7 @@
                 <w:noProof/>
                 <w:webHidden/>
               </w:rPr>
-              <w:t>1</w:t>
+              <w:t>8</w:t>
             </w:r>
             <w:r>
               <w:rPr>
@@ -460,7 +462,7 @@
               <w14:ligatures w14:val="standardContextual"/>
             </w:rPr>
           </w:pPr>
-          <w:hyperlink w:anchor="_Toc226808639" w:history="1">
+          <w:hyperlink w:anchor="_Toc226817633" w:history="1">
             <w:r>
               <w:rPr>
                 <w:rStyle w:val="Hipervnculo"/>
@@ -487,7 +489,7 @@
                 <w:noProof/>
                 <w:webHidden/>
               </w:rPr>
-              <w:instrText xml:space="preserve"> PAGEREF _Toc226808639 \h </w:instrText>
+              <w:instrText xml:space="preserve"> PAGEREF _Toc226817633 \h </w:instrText>
             </w:r>
             <w:r>
               <w:rPr>
@@ -507,7 +509,7 @@
                 <w:noProof/>
                 <w:webHidden/>
               </w:rPr>
-              <w:t>1</w:t>
+              <w:t>8</w:t>
             </w:r>
             <w:r>
               <w:rPr>
@@ -536,7 +538,7 @@
               <w14:ligatures w14:val="standardContextual"/>
             </w:rPr>
           </w:pPr>
-          <w:hyperlink w:anchor="_Toc226808640" w:history="1">
+          <w:hyperlink w:anchor="_Toc226817634" w:history="1">
             <w:r>
               <w:rPr>
                 <w:rStyle w:val="Hipervnculo"/>
@@ -563,7 +565,7 @@
                 <w:noProof/>
                 <w:webHidden/>
               </w:rPr>
-              <w:instrText xml:space="preserve"> PAGEREF _Toc226808640 \h </w:instrText>
+              <w:instrText xml:space="preserve"> PAGEREF _Toc226817634 \h </w:instrText>
             </w:r>
             <w:r>
               <w:rPr>
@@ -583,7 +585,7 @@
                 <w:noProof/>
                 <w:webHidden/>
               </w:rPr>
-              <w:t>1</w:t>
+              <w:t>8</w:t>
             </w:r>
             <w:r>
               <w:rPr>
@@ -610,7 +612,7 @@
               <w14:ligatures w14:val="standardContextual"/>
             </w:rPr>
           </w:pPr>
-          <w:hyperlink w:anchor="_Toc226808641" w:history="1">
+          <w:hyperlink w:anchor="_Toc226817635" w:history="1">
             <w:r>
               <w:rPr>
                 <w:rStyle w:val="Hipervnculo"/>
@@ -637,7 +639,7 @@
                 <w:noProof/>
                 <w:webHidden/>
               </w:rPr>
-              <w:instrText xml:space="preserve"> PAGEREF _Toc226808641 \h </w:instrText>
+              <w:instrText xml:space="preserve"> PAGEREF _Toc226817635 \h </w:instrText>
             </w:r>
             <w:r>
               <w:rPr>
@@ -657,7 +659,7 @@
                 <w:noProof/>
                 <w:webHidden/>
               </w:rPr>
-              <w:t>1</w:t>
+              <w:t>8</w:t>
             </w:r>
             <w:r>
               <w:rPr>
@@ -685,7 +687,7 @@
       <w:pPr>
         <w:pStyle w:val="Ttulo2"/>
       </w:pPr>
-      <w:bookmarkStart w:id="1" w:name="_Toc226808635"/>
+      <w:bookmarkStart w:id="1" w:name="_Toc226817629"/>
       <w:r>
         <w:t>Integrantes</w:t>
       </w:r>
@@ -888,8 +890,43 @@
       <w:pPr>
         <w:pStyle w:val="Ttulo2"/>
       </w:pPr>
-      <w:bookmarkStart w:id="2" w:name="_Toc226808636"/>
+      <w:bookmarkStart w:id="2" w:name="_Toc226817630"/>
+    </w:p>
+    <w:p>
+      <w:pPr>
+        <w:pStyle w:val="Ttulo2"/>
+      </w:pPr>
+    </w:p>
+    <w:p>
+      <w:pPr>
+        <w:pStyle w:val="Ttulo2"/>
+      </w:pPr>
+    </w:p>
+    <w:p>
+      <w:pPr>
+        <w:pStyle w:val="Ttulo2"/>
+      </w:pPr>
+    </w:p>
+    <w:p>
+      <w:pPr>
+        <w:pStyle w:val="Ttulo2"/>
+      </w:pPr>
+    </w:p>
+    <w:p>
+      <w:pPr>
+        <w:pStyle w:val="Ttulo2"/>
+      </w:pPr>
+    </w:p>
+    <w:p/>
+    <w:p/>
+    <w:p/>
+    <w:p/>
+    <w:p>
+      <w:pPr>
+        <w:pStyle w:val="Ttulo2"/>
+      </w:pPr>
       <w:r>
+        <w:lastRenderedPageBreak/>
         <w:t>Configuración</w:t>
       </w:r>
       <w:bookmarkEnd w:id="2"/>
@@ -898,22 +935,398 @@
       <w:pPr>
         <w:pStyle w:val="Ttulo3"/>
       </w:pPr>
-      <w:bookmarkStart w:id="3" w:name="_Toc226808637"/>
+      <w:bookmarkStart w:id="3" w:name="_Toc226817631"/>
       <w:r>
         <w:t>Configuración RDS</w:t>
       </w:r>
       <w:bookmarkEnd w:id="3"/>
     </w:p>
+    <w:p/>
+    <w:p>
+      <w:r>
+        <w:drawing>
+          <wp:inline distT="0" distB="0" distL="0" distR="0" wp14:anchorId="1EA70EBE" wp14:editId="0EC6664B">
+            <wp:extent cx="6400800" cy="5309376"/>
+            <wp:effectExtent l="0" t="0" r="0" b="0"/>
+            <wp:docPr id="485294288" name="Imagen 1"/>
+            <wp:cNvGraphicFramePr>
+              <a:graphicFrameLocks xmlns:a="http://schemas.openxmlformats.org/drawingml/2006/main" noChangeAspect="1"/>
+            </wp:cNvGraphicFramePr>
+            <a:graphic xmlns:a="http://schemas.openxmlformats.org/drawingml/2006/main">
+              <a:graphicData uri="http://schemas.openxmlformats.org/drawingml/2006/picture">
+                <pic:pic xmlns:pic="http://schemas.openxmlformats.org/drawingml/2006/picture">
+                  <pic:nvPicPr>
+                    <pic:cNvPr id="485294288" name=""/>
+                    <pic:cNvPicPr/>
+                  </pic:nvPicPr>
+                  <pic:blipFill>
+                    <a:blip r:embed="rId8"/>
+                    <a:stretch>
+                      <a:fillRect/>
+                    </a:stretch>
+                  </pic:blipFill>
+                  <pic:spPr>
+                    <a:xfrm>
+                      <a:off x="0" y="0"/>
+                      <a:ext cx="6420357" cy="5325598"/>
+                    </a:xfrm>
+                    <a:prstGeom prst="rect">
+                      <a:avLst/>
+                    </a:prstGeom>
+                  </pic:spPr>
+                </pic:pic>
+              </a:graphicData>
+            </a:graphic>
+          </wp:inline>
+        </w:drawing>
+      </w:r>
+    </w:p>
+    <w:p/>
+    <w:p>
+      <w:r>
+        <w:lastRenderedPageBreak/>
+        <w:drawing>
+          <wp:inline distT="0" distB="0" distL="0" distR="0" wp14:anchorId="48E6A37A" wp14:editId="137C5F64">
+            <wp:extent cx="6337426" cy="5991800"/>
+            <wp:effectExtent l="0" t="0" r="0" b="3175"/>
+            <wp:docPr id="931831500" name="Imagen 1"/>
+            <wp:cNvGraphicFramePr>
+              <a:graphicFrameLocks xmlns:a="http://schemas.openxmlformats.org/drawingml/2006/main" noChangeAspect="1"/>
+            </wp:cNvGraphicFramePr>
+            <a:graphic xmlns:a="http://schemas.openxmlformats.org/drawingml/2006/main">
+              <a:graphicData uri="http://schemas.openxmlformats.org/drawingml/2006/picture">
+                <pic:pic xmlns:pic="http://schemas.openxmlformats.org/drawingml/2006/picture">
+                  <pic:nvPicPr>
+                    <pic:cNvPr id="931831500" name=""/>
+                    <pic:cNvPicPr/>
+                  </pic:nvPicPr>
+                  <pic:blipFill>
+                    <a:blip r:embed="rId9"/>
+                    <a:stretch>
+                      <a:fillRect/>
+                    </a:stretch>
+                  </pic:blipFill>
+                  <pic:spPr>
+                    <a:xfrm>
+                      <a:off x="0" y="0"/>
+                      <a:ext cx="6350674" cy="6004325"/>
+                    </a:xfrm>
+                    <a:prstGeom prst="rect">
+                      <a:avLst/>
+                    </a:prstGeom>
+                  </pic:spPr>
+                </pic:pic>
+              </a:graphicData>
+            </a:graphic>
+          </wp:inline>
+        </w:drawing>
+      </w:r>
+    </w:p>
+    <w:p>
+      <w:r>
+        <w:lastRenderedPageBreak/>
+        <w:drawing>
+          <wp:inline distT="0" distB="0" distL="0" distR="0" wp14:anchorId="03C7867B" wp14:editId="3A633A4D">
+            <wp:extent cx="6355748" cy="4916032"/>
+            <wp:effectExtent l="0" t="0" r="0" b="0"/>
+            <wp:docPr id="1300593841" name="Imagen 1"/>
+            <wp:cNvGraphicFramePr>
+              <a:graphicFrameLocks xmlns:a="http://schemas.openxmlformats.org/drawingml/2006/main" noChangeAspect="1"/>
+            </wp:cNvGraphicFramePr>
+            <a:graphic xmlns:a="http://schemas.openxmlformats.org/drawingml/2006/main">
+              <a:graphicData uri="http://schemas.openxmlformats.org/drawingml/2006/picture">
+                <pic:pic xmlns:pic="http://schemas.openxmlformats.org/drawingml/2006/picture">
+                  <pic:nvPicPr>
+                    <pic:cNvPr id="1300593841" name=""/>
+                    <pic:cNvPicPr/>
+                  </pic:nvPicPr>
+                  <pic:blipFill>
+                    <a:blip r:embed="rId10"/>
+                    <a:stretch>
+                      <a:fillRect/>
+                    </a:stretch>
+                  </pic:blipFill>
+                  <pic:spPr>
+                    <a:xfrm>
+                      <a:off x="0" y="0"/>
+                      <a:ext cx="6388306" cy="4941215"/>
+                    </a:xfrm>
+                    <a:prstGeom prst="rect">
+                      <a:avLst/>
+                    </a:prstGeom>
+                  </pic:spPr>
+                </pic:pic>
+              </a:graphicData>
+            </a:graphic>
+          </wp:inline>
+        </w:drawing>
+      </w:r>
+    </w:p>
+    <w:p>
+      <w:r>
+        <w:lastRenderedPageBreak/>
+        <w:drawing>
+          <wp:inline distT="0" distB="0" distL="0" distR="0" wp14:anchorId="5CEE5EC0" wp14:editId="196FC7A6">
+            <wp:extent cx="6355533" cy="6070045"/>
+            <wp:effectExtent l="0" t="0" r="0" b="635"/>
+            <wp:docPr id="1809608777" name="Imagen 1"/>
+            <wp:cNvGraphicFramePr>
+              <a:graphicFrameLocks xmlns:a="http://schemas.openxmlformats.org/drawingml/2006/main" noChangeAspect="1"/>
+            </wp:cNvGraphicFramePr>
+            <a:graphic xmlns:a="http://schemas.openxmlformats.org/drawingml/2006/main">
+              <a:graphicData uri="http://schemas.openxmlformats.org/drawingml/2006/picture">
+                <pic:pic xmlns:pic="http://schemas.openxmlformats.org/drawingml/2006/picture">
+                  <pic:nvPicPr>
+                    <pic:cNvPr id="1809608777" name=""/>
+                    <pic:cNvPicPr/>
+                  </pic:nvPicPr>
+                  <pic:blipFill>
+                    <a:blip r:embed="rId11"/>
+                    <a:stretch>
+                      <a:fillRect/>
+                    </a:stretch>
+                  </pic:blipFill>
+                  <pic:spPr>
+                    <a:xfrm>
+                      <a:off x="0" y="0"/>
+                      <a:ext cx="6376951" cy="6090500"/>
+                    </a:xfrm>
+                    <a:prstGeom prst="rect">
+                      <a:avLst/>
+                    </a:prstGeom>
+                  </pic:spPr>
+                </pic:pic>
+              </a:graphicData>
+            </a:graphic>
+          </wp:inline>
+        </w:drawing>
+      </w:r>
+    </w:p>
+    <w:p>
+      <w:r>
+        <w:lastRenderedPageBreak/>
+        <w:drawing>
+          <wp:inline distT="0" distB="0" distL="0" distR="0" wp14:anchorId="78CE086B" wp14:editId="7625F0BD">
+            <wp:extent cx="6337426" cy="6048449"/>
+            <wp:effectExtent l="0" t="0" r="0" b="0"/>
+            <wp:docPr id="1222678347" name="Imagen 1"/>
+            <wp:cNvGraphicFramePr>
+              <a:graphicFrameLocks xmlns:a="http://schemas.openxmlformats.org/drawingml/2006/main" noChangeAspect="1"/>
+            </wp:cNvGraphicFramePr>
+            <a:graphic xmlns:a="http://schemas.openxmlformats.org/drawingml/2006/main">
+              <a:graphicData uri="http://schemas.openxmlformats.org/drawingml/2006/picture">
+                <pic:pic xmlns:pic="http://schemas.openxmlformats.org/drawingml/2006/picture">
+                  <pic:nvPicPr>
+                    <pic:cNvPr id="1222678347" name=""/>
+                    <pic:cNvPicPr/>
+                  </pic:nvPicPr>
+                  <pic:blipFill>
+                    <a:blip r:embed="rId12"/>
+                    <a:stretch>
+                      <a:fillRect/>
+                    </a:stretch>
+                  </pic:blipFill>
+                  <pic:spPr>
+                    <a:xfrm>
+                      <a:off x="0" y="0"/>
+                      <a:ext cx="6358697" cy="6068750"/>
+                    </a:xfrm>
+                    <a:prstGeom prst="rect">
+                      <a:avLst/>
+                    </a:prstGeom>
+                  </pic:spPr>
+                </pic:pic>
+              </a:graphicData>
+            </a:graphic>
+          </wp:inline>
+        </w:drawing>
+      </w:r>
+    </w:p>
+    <w:p>
+      <w:r>
+        <w:lastRenderedPageBreak/>
+        <w:drawing>
+          <wp:inline distT="0" distB="0" distL="0" distR="0" wp14:anchorId="60C75682" wp14:editId="518C80E2">
+            <wp:extent cx="6411849" cy="6083929"/>
+            <wp:effectExtent l="0" t="0" r="1905" b="0"/>
+            <wp:docPr id="34075029" name="Imagen 1"/>
+            <wp:cNvGraphicFramePr>
+              <a:graphicFrameLocks xmlns:a="http://schemas.openxmlformats.org/drawingml/2006/main" noChangeAspect="1"/>
+            </wp:cNvGraphicFramePr>
+            <a:graphic xmlns:a="http://schemas.openxmlformats.org/drawingml/2006/main">
+              <a:graphicData uri="http://schemas.openxmlformats.org/drawingml/2006/picture">
+                <pic:pic xmlns:pic="http://schemas.openxmlformats.org/drawingml/2006/picture">
+                  <pic:nvPicPr>
+                    <pic:cNvPr id="34075029" name=""/>
+                    <pic:cNvPicPr/>
+                  </pic:nvPicPr>
+                  <pic:blipFill>
+                    <a:blip r:embed="rId13"/>
+                    <a:stretch>
+                      <a:fillRect/>
+                    </a:stretch>
+                  </pic:blipFill>
+                  <pic:spPr>
+                    <a:xfrm>
+                      <a:off x="0" y="0"/>
+                      <a:ext cx="6435795" cy="6106650"/>
+                    </a:xfrm>
+                    <a:prstGeom prst="rect">
+                      <a:avLst/>
+                    </a:prstGeom>
+                  </pic:spPr>
+                </pic:pic>
+              </a:graphicData>
+            </a:graphic>
+          </wp:inline>
+        </w:drawing>
+      </w:r>
+    </w:p>
+    <w:p>
+      <w:r>
+        <w:lastRenderedPageBreak/>
+        <w:drawing>
+          <wp:inline distT="0" distB="0" distL="0" distR="0" wp14:anchorId="2C760231" wp14:editId="608D9CA4">
+            <wp:extent cx="6274052" cy="2954583"/>
+            <wp:effectExtent l="0" t="0" r="0" b="5080"/>
+            <wp:docPr id="1567625043" name="Imagen 1"/>
+            <wp:cNvGraphicFramePr>
+              <a:graphicFrameLocks xmlns:a="http://schemas.openxmlformats.org/drawingml/2006/main" noChangeAspect="1"/>
+            </wp:cNvGraphicFramePr>
+            <a:graphic xmlns:a="http://schemas.openxmlformats.org/drawingml/2006/main">
+              <a:graphicData uri="http://schemas.openxmlformats.org/drawingml/2006/picture">
+                <pic:pic xmlns:pic="http://schemas.openxmlformats.org/drawingml/2006/picture">
+                  <pic:nvPicPr>
+                    <pic:cNvPr id="1567625043" name=""/>
+                    <pic:cNvPicPr/>
+                  </pic:nvPicPr>
+                  <pic:blipFill>
+                    <a:blip r:embed="rId14"/>
+                    <a:stretch>
+                      <a:fillRect/>
+                    </a:stretch>
+                  </pic:blipFill>
+                  <pic:spPr>
+                    <a:xfrm>
+                      <a:off x="0" y="0"/>
+                      <a:ext cx="6296200" cy="2965013"/>
+                    </a:xfrm>
+                    <a:prstGeom prst="rect">
+                      <a:avLst/>
+                    </a:prstGeom>
+                  </pic:spPr>
+                </pic:pic>
+              </a:graphicData>
+            </a:graphic>
+          </wp:inline>
+        </w:drawing>
+      </w:r>
+    </w:p>
+    <w:p>
+      <w:r>
+        <w:drawing>
+          <wp:inline distT="0" distB="0" distL="0" distR="0" wp14:anchorId="45741677" wp14:editId="5F10E91A">
+            <wp:extent cx="6273800" cy="1262143"/>
+            <wp:effectExtent l="0" t="0" r="0" b="0"/>
+            <wp:docPr id="2018674110" name="Imagen 1"/>
+            <wp:cNvGraphicFramePr>
+              <a:graphicFrameLocks xmlns:a="http://schemas.openxmlformats.org/drawingml/2006/main" noChangeAspect="1"/>
+            </wp:cNvGraphicFramePr>
+            <a:graphic xmlns:a="http://schemas.openxmlformats.org/drawingml/2006/main">
+              <a:graphicData uri="http://schemas.openxmlformats.org/drawingml/2006/picture">
+                <pic:pic xmlns:pic="http://schemas.openxmlformats.org/drawingml/2006/picture">
+                  <pic:nvPicPr>
+                    <pic:cNvPr id="2018674110" name=""/>
+                    <pic:cNvPicPr/>
+                  </pic:nvPicPr>
+                  <pic:blipFill>
+                    <a:blip r:embed="rId15"/>
+                    <a:stretch>
+                      <a:fillRect/>
+                    </a:stretch>
+                  </pic:blipFill>
+                  <pic:spPr>
+                    <a:xfrm>
+                      <a:off x="0" y="0"/>
+                      <a:ext cx="6338460" cy="1275151"/>
+                    </a:xfrm>
+                    <a:prstGeom prst="rect">
+                      <a:avLst/>
+                    </a:prstGeom>
+                  </pic:spPr>
+                </pic:pic>
+              </a:graphicData>
+            </a:graphic>
+          </wp:inline>
+        </w:drawing>
+      </w:r>
+    </w:p>
+    <w:p>
+      <w:pPr>
+        <w:pStyle w:val="Ttulo4"/>
+      </w:pPr>
+    </w:p>
+    <w:p>
+      <w:pPr>
+        <w:pStyle w:val="Ttulo4"/>
+      </w:pPr>
+      <w:r>
+        <w:t>Detalles conexión</w:t>
+      </w:r>
+    </w:p>
+    <w:p/>
+    <w:p>
+      <w:r>
+        <w:t>HOST=</w:t>
+      </w:r>
+      <w:r>
+        <w:t xml:space="preserve"> </w:t>
+      </w:r>
+      <w:r>
+        <w:t>database-blacklist-db.co3ysyuwoxad.us-east-1.rds.amazonaws.com</w:t>
+      </w:r>
+    </w:p>
+    <w:p>
+      <w:r>
+        <w:t>PORT=</w:t>
+      </w:r>
+      <w:r>
+        <w:t xml:space="preserve"> 5432</w:t>
+      </w:r>
+    </w:p>
+    <w:p>
+      <w:r>
+        <w:t>DATABASE=</w:t>
+      </w:r>
+      <w:r>
+        <w:t xml:space="preserve"> </w:t>
+      </w:r>
+      <w:proofErr w:type="spellStart"/>
+      <w:r>
+        <w:t>blacklist_db</w:t>
+      </w:r>
+      <w:proofErr w:type="spellEnd"/>
+    </w:p>
+    <w:p>
+      <w:r>
+        <w:t>USER=</w:t>
+      </w:r>
+      <w:r>
+        <w:t xml:space="preserve"> </w:t>
+      </w:r>
+      <w:proofErr w:type="spellStart"/>
+      <w:r>
+        <w:t>postgres</w:t>
+      </w:r>
+      <w:proofErr w:type="spellEnd"/>
+    </w:p>
     <w:p>
       <w:pPr>
         <w:pStyle w:val="Ttulo3"/>
       </w:pPr>
-      <w:bookmarkStart w:id="4" w:name="_Toc226808638"/>
+      <w:bookmarkStart w:id="4" w:name="_Toc226817632"/>
       <w:r>
-        <w:t xml:space="preserve">Configuración </w:t>
-      </w:r>
-      <w:r>
-        <w:t xml:space="preserve">proyecto en AWS </w:t>
+        <w:t xml:space="preserve">Configuración proyecto en AWS </w:t>
       </w:r>
       <w:proofErr w:type="spellStart"/>
       <w:r>
@@ -922,11 +1335,144 @@
       <w:bookmarkEnd w:id="4"/>
       <w:proofErr w:type="spellEnd"/>
     </w:p>
+    <w:p/>
+    <w:p>
+      <w:r>
+        <w:t>Se comprime el proyecto en un zip:</w:t>
+      </w:r>
+    </w:p>
+    <w:p>
+      <w:r>
+        <w:drawing>
+          <wp:inline distT="0" distB="0" distL="0" distR="0" wp14:anchorId="07E3B352" wp14:editId="3552E937">
+            <wp:extent cx="5275813" cy="571763"/>
+            <wp:effectExtent l="0" t="0" r="0" b="0"/>
+            <wp:docPr id="324263643" name="Imagen 1"/>
+            <wp:cNvGraphicFramePr>
+              <a:graphicFrameLocks xmlns:a="http://schemas.openxmlformats.org/drawingml/2006/main" noChangeAspect="1"/>
+            </wp:cNvGraphicFramePr>
+            <a:graphic xmlns:a="http://schemas.openxmlformats.org/drawingml/2006/main">
+              <a:graphicData uri="http://schemas.openxmlformats.org/drawingml/2006/picture">
+                <pic:pic xmlns:pic="http://schemas.openxmlformats.org/drawingml/2006/picture">
+                  <pic:nvPicPr>
+                    <pic:cNvPr id="324263643" name=""/>
+                    <pic:cNvPicPr/>
+                  </pic:nvPicPr>
+                  <pic:blipFill>
+                    <a:blip r:embed="rId16"/>
+                    <a:stretch>
+                      <a:fillRect/>
+                    </a:stretch>
+                  </pic:blipFill>
+                  <pic:spPr>
+                    <a:xfrm>
+                      <a:off x="0" y="0"/>
+                      <a:ext cx="5294885" cy="573830"/>
+                    </a:xfrm>
+                    <a:prstGeom prst="rect">
+                      <a:avLst/>
+                    </a:prstGeom>
+                  </pic:spPr>
+                </pic:pic>
+              </a:graphicData>
+            </a:graphic>
+          </wp:inline>
+        </w:drawing>
+      </w:r>
+    </w:p>
+    <w:p/>
+    <w:p>
+      <w:r>
+        <w:t>Dentro de este zip se encuentra la siguiente estructura:</w:t>
+      </w:r>
+    </w:p>
+    <w:p>
+      <w:r>
+        <w:lastRenderedPageBreak/>
+        <w:drawing>
+          <wp:inline distT="0" distB="0" distL="0" distR="0" wp14:anchorId="41111B8A" wp14:editId="375505D5">
+            <wp:extent cx="5612130" cy="3054350"/>
+            <wp:effectExtent l="0" t="0" r="1270" b="6350"/>
+            <wp:docPr id="140950696" name="Imagen 1"/>
+            <wp:cNvGraphicFramePr>
+              <a:graphicFrameLocks xmlns:a="http://schemas.openxmlformats.org/drawingml/2006/main" noChangeAspect="1"/>
+            </wp:cNvGraphicFramePr>
+            <a:graphic xmlns:a="http://schemas.openxmlformats.org/drawingml/2006/main">
+              <a:graphicData uri="http://schemas.openxmlformats.org/drawingml/2006/picture">
+                <pic:pic xmlns:pic="http://schemas.openxmlformats.org/drawingml/2006/picture">
+                  <pic:nvPicPr>
+                    <pic:cNvPr id="140950696" name=""/>
+                    <pic:cNvPicPr/>
+                  </pic:nvPicPr>
+                  <pic:blipFill>
+                    <a:blip r:embed="rId17"/>
+                    <a:stretch>
+                      <a:fillRect/>
+                    </a:stretch>
+                  </pic:blipFill>
+                  <pic:spPr>
+                    <a:xfrm>
+                      <a:off x="0" y="0"/>
+                      <a:ext cx="5612130" cy="3054350"/>
+                    </a:xfrm>
+                    <a:prstGeom prst="rect">
+                      <a:avLst/>
+                    </a:prstGeom>
+                  </pic:spPr>
+                </pic:pic>
+              </a:graphicData>
+            </a:graphic>
+          </wp:inline>
+        </w:drawing>
+      </w:r>
+    </w:p>
+    <w:p/>
+    <w:p>
+      <w:r>
+        <w:drawing>
+          <wp:inline distT="0" distB="0" distL="0" distR="0" wp14:anchorId="6D4CD314" wp14:editId="5F4611E7">
+            <wp:extent cx="6053688" cy="2609018"/>
+            <wp:effectExtent l="0" t="0" r="4445" b="0"/>
+            <wp:docPr id="1169626643" name="Imagen 1"/>
+            <wp:cNvGraphicFramePr>
+              <a:graphicFrameLocks xmlns:a="http://schemas.openxmlformats.org/drawingml/2006/main" noChangeAspect="1"/>
+            </wp:cNvGraphicFramePr>
+            <a:graphic xmlns:a="http://schemas.openxmlformats.org/drawingml/2006/main">
+              <a:graphicData uri="http://schemas.openxmlformats.org/drawingml/2006/picture">
+                <pic:pic xmlns:pic="http://schemas.openxmlformats.org/drawingml/2006/picture">
+                  <pic:nvPicPr>
+                    <pic:cNvPr id="1169626643" name=""/>
+                    <pic:cNvPicPr/>
+                  </pic:nvPicPr>
+                  <pic:blipFill>
+                    <a:blip r:embed="rId18"/>
+                    <a:stretch>
+                      <a:fillRect/>
+                    </a:stretch>
+                  </pic:blipFill>
+                  <pic:spPr>
+                    <a:xfrm>
+                      <a:off x="0" y="0"/>
+                      <a:ext cx="6079540" cy="2620160"/>
+                    </a:xfrm>
+                    <a:prstGeom prst="rect">
+                      <a:avLst/>
+                    </a:prstGeom>
+                  </pic:spPr>
+                </pic:pic>
+              </a:graphicData>
+            </a:graphic>
+          </wp:inline>
+        </w:drawing>
+      </w:r>
+    </w:p>
+    <w:p/>
+    <w:p/>
     <w:p>
       <w:pPr>
         <w:pStyle w:val="Ttulo3"/>
       </w:pPr>
-      <w:bookmarkStart w:id="5" w:name="_Toc226808639"/>
+      <w:bookmarkStart w:id="5" w:name="_Toc226817633"/>
       <w:r>
         <w:t xml:space="preserve">Configuración </w:t>
       </w:r>
@@ -949,7 +1495,7 @@
       <w:pPr>
         <w:pStyle w:val="Ttulo2"/>
       </w:pPr>
-      <w:bookmarkStart w:id="6" w:name="_Toc226808640"/>
+      <w:bookmarkStart w:id="6" w:name="_Toc226817634"/>
       <w:r>
         <w:t>Estrategias de despliegue</w:t>
       </w:r>
@@ -959,7 +1505,7 @@
       <w:pPr>
         <w:pStyle w:val="Ttulo3"/>
       </w:pPr>
-      <w:bookmarkStart w:id="7" w:name="_Toc226808641"/>
+      <w:bookmarkStart w:id="7" w:name="_Toc226817635"/>
       <w:proofErr w:type="spellStart"/>
       <w:r>
         <w:t>All</w:t>
@@ -1015,6 +1561,7 @@
         </w:numPr>
       </w:pPr>
       <w:r>
+        <w:lastRenderedPageBreak/>
         <w:t>Si el despliegue se realizó sobre instancias iniciales o sobre nuevas instancias</w:t>
       </w:r>
     </w:p>
@@ -1044,8 +1591,8 @@
     </w:p>
     <w:p/>
     <w:sectPr>
-      <w:headerReference w:type="default" r:id="rId8"/>
-      <w:footerReference w:type="default" r:id="rId9"/>
+      <w:headerReference w:type="default" r:id="rId19"/>
+      <w:footerReference w:type="default" r:id="rId20"/>
       <w:pgSz w:w="12240" w:h="15840"/>
       <w:pgMar w:top="2268" w:right="1701" w:bottom="1418" w:left="1701" w:header="709" w:footer="709" w:gutter="0"/>
       <w:cols w:space="708"/>
@@ -7663,7 +8210,6 @@
     <w:basedOn w:val="Normal"/>
     <w:next w:val="Normal"/>
     <w:uiPriority w:val="9"/>
-    <w:semiHidden/>
     <w:unhideWhenUsed/>
     <w:qFormat/>
     <w:rsid w:val="00940945"/>

</xml_diff>